<commit_message>
Prepare Rubric Loom Bundle v1.3.3
</commit_message>
<xml_diff>
--- a/workspace/reference/templates/rubric-weave/v1/rubric-weave-intake-template.docx
+++ b/workspace/reference/templates/rubric-weave/v1/rubric-weave-intake-template.docx
@@ -494,7 +494,7 @@
           <w:b/>
           <w:sz w:val="22"/>
         </w:rPr>
-        <w:t xml:space="preserve">Edit the synthetic example. </w:t>
+        <w:t xml:space="preserve">Replace the synthetic example. </w:t>
       </w:r>
       <w:r>
         <w:rPr>
@@ -502,7 +502,7 @@
           <w:b w:val="0"/>
           <w:sz w:val="22"/>
         </w:rPr>
-        <w:t>Replace the title, criteria, level names, numeric scores, weights, and descriptions. You may add or remove criterion rows and performance-level columns; keep one Criterion column, one criterion per row, and at least two uniquely named level columns.</w:t>
+        <w:t>Replace the title, criteria, level names, numeric scores, weights, and descriptions. You may add or remove criterion rows and performance-level columns as needed.</w:t>
       </w:r>
     </w:p>
     <w:p>
@@ -516,7 +516,7 @@
           <w:b/>
           <w:sz w:val="22"/>
         </w:rPr>
-        <w:t xml:space="preserve">Keep scoring explicit. </w:t>
+        <w:t xml:space="preserve">Give every rubric a title. </w:t>
       </w:r>
       <w:r>
         <w:rPr>
@@ -524,7 +524,7 @@
           <w:b w:val="0"/>
           <w:sz w:val="22"/>
         </w:rPr>
-        <w:t>Put exactly one numeric score in every level header, such as Ready to Share (100). The Weight column is structurally optional, but this example includes explicit positive weights totaling 100 so it needs no fallback.</w:t>
+        <w:t>In Word, use one Heading 1 line immediately above the table. In Markdown, begin the title with ##. A table without a title in that position will not be read as a rubric.</w:t>
       </w:r>
     </w:p>
     <w:p>
@@ -538,7 +538,7 @@
           <w:b/>
           <w:sz w:val="22"/>
         </w:rPr>
-        <w:t xml:space="preserve">Avoid ambiguous Word structure. </w:t>
+        <w:t xml:space="preserve">Use this table shape. </w:t>
       </w:r>
       <w:r>
         <w:rPr>
@@ -546,7 +546,7 @@
           <w:b w:val="0"/>
           <w:sz w:val="22"/>
         </w:rPr>
-        <w:t>Keep one simple rectangular table. Do not merge cells, nest tables, use multiple header bands, add row-number or notes columns, detach scoring into another table, or rely on a decorative layout. Correct ambiguous structure or use Markdown or JSON.</w:t>
+        <w:t>Keep one Criterion column, an optional Weight column, and at least two performance-level columns. Include one criterion per row, one numeric score in each level heading, and a description in every level cell. If included, positive weights must total 100.</w:t>
       </w:r>
     </w:p>
     <w:p>
@@ -560,7 +560,7 @@
           <w:b/>
           <w:sz w:val="22"/>
         </w:rPr>
-        <w:t xml:space="preserve">Correct or approve a fallback visibly. </w:t>
+        <w:t xml:space="preserve">Add more rubrics by repeating the block. </w:t>
       </w:r>
       <w:r>
         <w:rPr>
@@ -568,7 +568,7 @@
           <w:b w:val="0"/>
           <w:sz w:val="22"/>
         </w:rPr>
-        <w:t>If preflight reports missing or ambiguous scores or weights, correct the source and run it again. Approve even spacing or equal weights only when you intentionally choose that fallback; the producer records the approval and never invents scoring silently.</w:t>
+        <w:t>This file can package multiple rubrics. Before these instructions, add a unique title followed immediately by its own table for each rubric. In Word, use Heading 1 titles. In Markdown, use ## titles.</w:t>
       </w:r>
     </w:p>
     <w:p>
@@ -582,7 +582,7 @@
           <w:b/>
           <w:sz w:val="22"/>
         </w:rPr>
-        <w:t xml:space="preserve">Respect the Brightspace boundary. </w:t>
+        <w:t xml:space="preserve">Keep tables simple. </w:t>
       </w:r>
       <w:r>
         <w:rPr>
@@ -590,7 +590,7 @@
           <w:b w:val="0"/>
           <w:sz w:val="22"/>
         </w:rPr>
-        <w:t>Weave builds and validates a rubric-only import package; that is not a Brightspace import or proof of Brightspace acceptance. Importing the package does not attach the rubric to an assignment, discussion, quiz, or grade item. Activity attachment is a separate manual step.</w:t>
+        <w:t>Use rectangular tables with no merged or nested cells, extra notes or row-number columns, or multiple header rows. Weave will flag missing scores or weights for correction or explicit approval. It creates a rubric-only package; Brightspace import and activity attachment are separate steps.</w:t>
       </w:r>
     </w:p>
     <w:sectPr>

</xml_diff>

<commit_message>
Release v1.3.3: improve template handoff and isolate runtime repair (#6)
* Prepare Rubric Loom Bundle v1.3.3

* Fix private runtime identity and verify native bootstrap recovery
</commit_message>
<xml_diff>
--- a/workspace/reference/templates/rubric-weave/v1/rubric-weave-intake-template.docx
+++ b/workspace/reference/templates/rubric-weave/v1/rubric-weave-intake-template.docx
@@ -494,7 +494,7 @@
           <w:b/>
           <w:sz w:val="22"/>
         </w:rPr>
-        <w:t xml:space="preserve">Edit the synthetic example. </w:t>
+        <w:t xml:space="preserve">Replace the synthetic example. </w:t>
       </w:r>
       <w:r>
         <w:rPr>
@@ -502,7 +502,7 @@
           <w:b w:val="0"/>
           <w:sz w:val="22"/>
         </w:rPr>
-        <w:t>Replace the title, criteria, level names, numeric scores, weights, and descriptions. You may add or remove criterion rows and performance-level columns; keep one Criterion column, one criterion per row, and at least two uniquely named level columns.</w:t>
+        <w:t>Replace the title, criteria, level names, numeric scores, weights, and descriptions. You may add or remove criterion rows and performance-level columns as needed.</w:t>
       </w:r>
     </w:p>
     <w:p>
@@ -516,7 +516,7 @@
           <w:b/>
           <w:sz w:val="22"/>
         </w:rPr>
-        <w:t xml:space="preserve">Keep scoring explicit. </w:t>
+        <w:t xml:space="preserve">Give every rubric a title. </w:t>
       </w:r>
       <w:r>
         <w:rPr>
@@ -524,7 +524,7 @@
           <w:b w:val="0"/>
           <w:sz w:val="22"/>
         </w:rPr>
-        <w:t>Put exactly one numeric score in every level header, such as Ready to Share (100). The Weight column is structurally optional, but this example includes explicit positive weights totaling 100 so it needs no fallback.</w:t>
+        <w:t>In Word, use one Heading 1 line immediately above the table. In Markdown, begin the title with ##. A table without a title in that position will not be read as a rubric.</w:t>
       </w:r>
     </w:p>
     <w:p>
@@ -538,7 +538,7 @@
           <w:b/>
           <w:sz w:val="22"/>
         </w:rPr>
-        <w:t xml:space="preserve">Avoid ambiguous Word structure. </w:t>
+        <w:t xml:space="preserve">Use this table shape. </w:t>
       </w:r>
       <w:r>
         <w:rPr>
@@ -546,7 +546,7 @@
           <w:b w:val="0"/>
           <w:sz w:val="22"/>
         </w:rPr>
-        <w:t>Keep one simple rectangular table. Do not merge cells, nest tables, use multiple header bands, add row-number or notes columns, detach scoring into another table, or rely on a decorative layout. Correct ambiguous structure or use Markdown or JSON.</w:t>
+        <w:t>Keep one Criterion column, an optional Weight column, and at least two performance-level columns. Include one criterion per row, one numeric score in each level heading, and a description in every level cell. If included, positive weights must total 100.</w:t>
       </w:r>
     </w:p>
     <w:p>
@@ -560,7 +560,7 @@
           <w:b/>
           <w:sz w:val="22"/>
         </w:rPr>
-        <w:t xml:space="preserve">Correct or approve a fallback visibly. </w:t>
+        <w:t xml:space="preserve">Add more rubrics by repeating the block. </w:t>
       </w:r>
       <w:r>
         <w:rPr>
@@ -568,7 +568,7 @@
           <w:b w:val="0"/>
           <w:sz w:val="22"/>
         </w:rPr>
-        <w:t>If preflight reports missing or ambiguous scores or weights, correct the source and run it again. Approve even spacing or equal weights only when you intentionally choose that fallback; the producer records the approval and never invents scoring silently.</w:t>
+        <w:t>This file can package multiple rubrics. Before these instructions, add a unique title followed immediately by its own table for each rubric. In Word, use Heading 1 titles. In Markdown, use ## titles.</w:t>
       </w:r>
     </w:p>
     <w:p>
@@ -582,7 +582,7 @@
           <w:b/>
           <w:sz w:val="22"/>
         </w:rPr>
-        <w:t xml:space="preserve">Respect the Brightspace boundary. </w:t>
+        <w:t xml:space="preserve">Keep tables simple. </w:t>
       </w:r>
       <w:r>
         <w:rPr>
@@ -590,7 +590,7 @@
           <w:b w:val="0"/>
           <w:sz w:val="22"/>
         </w:rPr>
-        <w:t>Weave builds and validates a rubric-only import package; that is not a Brightspace import or proof of Brightspace acceptance. Importing the package does not attach the rubric to an assignment, discussion, quiz, or grade item. Activity attachment is a separate manual step.</w:t>
+        <w:t>Use rectangular tables with no merged or nested cells, extra notes or row-number columns, or multiple header rows. Weave will flag missing scores or weights for correction or explicit approval. It creates a rubric-only package; Brightspace import and activity attachment are separate steps.</w:t>
       </w:r>
     </w:p>
     <w:sectPr>

</xml_diff>